<commit_message>
Disclose that the order-repair equation is the author's prior lattice model
The ODE, feedback function, inversion and saddle-node structure come from
Self-Maintained Order and Hysteretic Collapse in a Non-Equilibrium Rotational
Lattice (10.5281/zenodo.21210708). Now cited in the manuscript, declared in the
cover letter, and stated in the README. This also answers the review comment
that bistability was merely a consequence of the chosen functional form.

Co-Authored-By: Claude Opus 5 <noreply@anthropic.com>
</commit_message>
<xml_diff>
--- a/manuscript/Repair_Fidelity_Control_Parameter_BioEssays_v2.docx
+++ b/manuscript/Repair_Fidelity_Control_Parameter_BioEssays_v2.docx
@@ -1516,22 +1516,20 @@
           <w:sz w:val="22"/>
           <w:lang w:val="en-US"/>
         </w:rPr>
-        <w:t xml:space="preserve"> tissue supports its own maintenance machinery better than eroded tissue does. Positive feedback of this form is the standard route to bistability in cell-biological systems (Ferrell 2002), and the model inherits that </w:t>
-      </w:r>
-      <w:r>
-        <w:rPr>
-          <w:lang w:val="en-US"/>
-        </w:rPr>
-        <w:t>behavior</w:t>
-      </w:r>
-      <w:r>
-        <w:rPr>
-          <w:b w:val="false"/>
-          <w:i w:val="false"/>
-          <w:sz w:val="22"/>
-          <w:lang w:val="en-US"/>
-        </w:rPr>
-        <w:t xml:space="preserve"> by construction rather than discovering it.</w:t>
+        <w:t xml:space="preserve"> tissue supports its own maintenance machinery better than eroded tissue does. Positive feedback of this form is the standard route to bistability in cell-biological systems (Ferrell 2002), and the model inherits that behavior by construction rather than discovering it. The equation is not introduced here for the first time. It is the mean-field reduction of a non-equilibrium lattice model in which an ordered medium is continuously degraded by a flux that accelerates with local disorder and restored by an independent repair process, analyzed separately in a physical setting (Sandler 2026). That analysis establishes the bistability as a proposition for the reduced model and confirms by kinetic Monte Carlo that it survives on a finite lattice as a rate-dependent hysteresis loop, rather than being an artifact of the mean-field closure. What is proposed here is not the equation but the identification of its control parameter with repair fidelity in tissue, and what follows from that identification.</w:t>
+      </w:r>
+      <w:r>
+        <w:rPr>
+          <w:lang w:val="en-US"/>
+        </w:rPr>
+      </w:r>
+      <w:r>
+        <w:rPr>
+          <w:b w:val="false"/>
+          <w:i w:val="false"/>
+          <w:sz w:val="22"/>
+          <w:lang w:val="en-US"/>
+        </w:rPr>
       </w:r>
     </w:p>
     <w:p>
@@ -1739,7 +1737,7 @@
           <w:sz w:val="21"/>
           <w:lang w:val="en-US"/>
         </w:rPr>
-        <w:t>Bistability here is a consequence of the functional form chosen, not an empirical discovery. The question worth asking is what moves the threshold.</w:t>
+        <w:t>Bistability here is inherited from the underlying lattice model, not discovered in tissue. The question worth asking is what moves the threshold.</w:t>
       </w:r>
     </w:p>
     <w:p>
@@ -4436,16 +4434,15 @@
           <w:sz w:val="22"/>
           <w:lang w:val="en-US"/>
         </w:rPr>
-        <w:t xml:space="preserve">The model is phenomenological. </w:t>
-      </w:r>
-      <w:r>
-        <w:rPr>
-          <w:b w:val="false"/>
-          <w:i w:val="false"/>
-          <w:sz w:val="22"/>
-          <w:lang w:val="en-US"/>
-        </w:rPr>
-        <w:t>The form of μ(I) and its parameters were chosen for qualitative consistency with a bistable, hysteretic system, not fitted to measurements.</w:t>
+        <w:t>The model is phenomenological as applied to tissue. The form of μ(I) is taken from the lattice model of Sandler (2026), where it follows from an explicitly specified site process; its parameters here were chosen for qualitative consistency with a bistable, hysteretic system and are not fitted to any biological measurement.</w:t>
+      </w:r>
+      <w:r>
+        <w:rPr>
+          <w:b w:val="false"/>
+          <w:i w:val="false"/>
+          <w:sz w:val="22"/>
+          <w:lang w:val="en-US"/>
+        </w:rPr>
       </w:r>
       <w:r>
         <w:rPr>
@@ -5387,6 +5384,18 @@
           <w:lang w:val="en-US"/>
         </w:rPr>
         <w:t>López-Otín C, Blasco MA, Partridge L, Serrano M, Kroemer G (2023) Hallmarks of aging: an expanding universe. Cell 186:243-278. https://doi.org/10.1016/j.cell.2022.11.001</w:t>
+      </w:r>
+    </w:p>
+    <w:p>
+      <w:pPr>
+        <w:spacing w:line="360" w:lineRule="auto" w:after="60"/>
+        <w:ind w:hanging="432"/>
+      </w:pPr>
+      <w:r>
+        <w:rPr>
+          <w:sz w:val="20"/>
+        </w:rPr>
+        <w:t>Sandler L (2026) Self-maintained order and hysteretic collapse in a non-equilibrium rotational lattice. Zenodo (preprint; under review). https://doi.org/10.5281/zenodo.21210708</w:t>
       </w:r>
     </w:p>
     <w:p>

</xml_diff>